<commit_message>
Shorten the About section of the submission doc
The section now names the course and says what the system answers.
The citation sentence and the results sentence are removed.

Co-Authored-By: Claude Opus 5.5 <noreply@anthropic.com>
</commit_message>
<xml_diff>
--- a/Assignments/Research_Paper_Navigator_Submission_Butler.docx
+++ b/Assignments/Research_Paper_Navigator_Submission_Butler.docx
@@ -45,35 +45,7 @@
         <w:rPr>
           <w:color w:val="595959"/>
         </w:rPr>
-        <w:t xml:space="preserve">Gary </w:t>
-      </w:r>
-      <w:proofErr w:type="gramStart"/>
-      <w:r>
-        <w:rPr>
-          <w:color w:val="595959"/>
-        </w:rPr>
-        <w:t>Butler  ·</w:t>
-      </w:r>
-      <w:proofErr w:type="gramEnd"/>
-      <w:r>
-        <w:rPr>
-          <w:color w:val="595959"/>
-        </w:rPr>
-        <w:t xml:space="preserve">  MIT xPRO, RAG and Context </w:t>
-      </w:r>
-      <w:proofErr w:type="gramStart"/>
-      <w:r>
-        <w:rPr>
-          <w:color w:val="595959"/>
-        </w:rPr>
-        <w:t>Engineering  ·</w:t>
-      </w:r>
-      <w:proofErr w:type="gramEnd"/>
-      <w:r>
-        <w:rPr>
-          <w:color w:val="595959"/>
-        </w:rPr>
-        <w:t xml:space="preserve">  14 October 2026</w:t>
+        <w:t>Gary Butler  ·  MIT xPRO, RAG and Context Engineering  ·  14 October 2026</w:t>
       </w:r>
     </w:p>
     <w:p>
@@ -133,7 +105,16 @@
         <w:spacing w:after="120"/>
       </w:pPr>
       <w:r>
-        <w:t>Research Paper Navigator answers questions about a fixed collection of 153 computer science research papers. Each claim in an answer cites the file and page it came from, so the reader can check it. When the papers do not contain the answer, the system says so and does not guess.</w:t>
+        <w:t xml:space="preserve">Research Paper Navigator </w:t>
+      </w:r>
+      <w:r>
+        <w:t xml:space="preserve">is the capstone project for the RAG and Context Engineering course by MIT xPRO.  It </w:t>
+      </w:r>
+      <w:r>
+        <w:t xml:space="preserve">answers questions about a fixed collection of 153 computer science research papers. </w:t>
+      </w:r>
+      <w:r>
+        <w:t xml:space="preserve"> </w:t>
       </w:r>
     </w:p>
     <w:p>
@@ -141,7 +122,7 @@
         <w:spacing w:after="120"/>
       </w:pPr>
       <w:r>
-        <w:t>On the 12 test questions, the final system (checkpoint 8.1) answered 12 of 12 correctly with the gpt-5.4-mini judge and 11 of 12 with the gpt-5.4 judge. The 7.1 baseline answered 10 of 12 and 9 of 12.</w:t>
+        <w:t xml:space="preserve"> </w:t>
       </w:r>
     </w:p>
     <w:p>
@@ -165,7 +146,6 @@
       <w:pPr>
         <w:spacing w:after="60"/>
       </w:pPr>
-      <w:proofErr w:type="gramStart"/>
       <w:r>
         <w:rPr>
           <w:b/>
@@ -174,11 +154,7 @@
         <w:t>Research_Paper_Navigator_Capstone_Butler.mp4</w:t>
       </w:r>
       <w:r>
-        <w:t xml:space="preserve">  (</w:t>
-      </w:r>
-      <w:proofErr w:type="gramEnd"/>
-      <w:r>
-        <w:t>13 min 32 s)</w:t>
+        <w:t xml:space="preserve">  (13 min 32 s)</w:t>
       </w:r>
     </w:p>
     <w:p>

</xml_diff>